<commit_message>
Rendre le portfolio prêt à lire, sans signature.
Les textes s’adressent au visiteur. Les certificats publics sont consultables. Le bandeau entrepreneur suit le thème clair, et le CV reprend le même design sans emplacement de signature.

Co-authored-by: edosservices <edosservices@users.noreply.github.com>
</commit_message>
<xml_diff>
--- a/public/cv/cv-edouard-bengehya-en.docx
+++ b/public/cv/cv-edouard-bengehya-en.docx
@@ -89,7 +89,7 @@
     </w:p>
     <w:p>
       <w:r>
-        <w:t xml:space="preserve">Training in telecommunications engineering and management at Hope Africa University (Burundi, 2020–2022), with studies in network architecture and CCNA, software maintenance and office tools, and a technical diploma in general agriculture from Idjwi.</w:t>
+        <w:t xml:space="preserve">I graduated in telecommunications engineering and management from Hope Africa University (Burundi, 2020–2022), with distinction, concentration in systems and network security. I also completed network architecture and CCNA, software maintenance and office tools, and a technical diploma in general agriculture from Idjwi.</w:t>
       </w:r>
     </w:p>
     <w:p>
@@ -349,7 +349,7 @@
     </w:p>
     <w:p>
       <w:r>
-        <w:t xml:space="preserve">Practical training in network administration, information security, maintenance, web development and complex problem solving.</w:t>
+        <w:t xml:space="preserve">Practical training in network administration, information security, maintenance, web development and complex problem solving. Bachelor’s degree awarded with distinction, concentration in systems and network security.</w:t>
       </w:r>
     </w:p>
     <w:p>
@@ -393,6 +393,11 @@
       </w:r>
     </w:p>
     <w:p>
+      <w:r>
+        <w:t xml:space="preserve">Modern agricultural techniques, crop management, farm optimization, input management and lasting improvement of agricultural productivity.</w:t>
+      </w:r>
+    </w:p>
+    <w:p>
       <w:pPr>
         <w:pStyle w:val="Heading2"/>
       </w:pPr>
@@ -407,7 +412,12 @@
     </w:p>
     <w:p>
       <w:r>
-        <w:t xml:space="preserve">Academic diplomas and attestations · Hope Africa University · Date not stated in the documents provided</w:t>
+        <w:t xml:space="preserve">Telecommunications Engineering and Management · Hope Africa University</w:t>
+      </w:r>
+    </w:p>
+    <w:p>
+      <w:r>
+        <w:t xml:space="preserve">Distinction. Concentration: systems and network security.</w:t>
       </w:r>
     </w:p>
     <w:p>
@@ -417,7 +427,7 @@
     </w:p>
     <w:p>
       <w:r>
-        <w:t xml:space="preserve">Computer networks · Issuer not stated in the documents provided · Date not stated in the documents provided · 90 hours</w:t>
+        <w:t xml:space="preserve">Computer networks · CARS, Université Espoir d’Afrique · 20 February 2020 · 90 hours</w:t>
       </w:r>
     </w:p>
     <w:p>
@@ -427,7 +437,7 @@
     </w:p>
     <w:p>
       <w:r>
-        <w:t xml:space="preserve">Network security and administration · Issuer not stated in the documents provided · Date not stated in the documents provided · 90 hours</w:t>
+        <w:t xml:space="preserve">Network security and administration · CARS, Université Espoir d’Afrique · 23 October 2021 · 90 hours</w:t>
       </w:r>
     </w:p>
     <w:p>
@@ -437,22 +447,7 @@
     </w:p>
     <w:p>
       <w:r>
-        <w:t xml:space="preserve">Software and hardware maintenance · Issuer not stated in the documents provided · Date not stated in the documents provided · 90 hours</w:t>
-      </w:r>
-    </w:p>
-    <w:p>
-      <w:r>
-        <w:t xml:space="preserve">State diploma</w:t>
-      </w:r>
-    </w:p>
-    <w:p>
-      <w:r>
-        <w:t xml:space="preserve">Academic diplomas and attestations · Issuer not stated in the documents provided · Date not stated in the documents provided</w:t>
-      </w:r>
-    </w:p>
-    <w:p>
-      <w:r>
-        <w:t xml:space="preserve">Congolese state diploma. The year and the school are not stated in the material provided, beyond the title.</w:t>
+        <w:t xml:space="preserve">Software and hardware maintenance · CARS, Université Espoir d’Afrique · 23 October 2021 · 90 hours</w:t>
       </w:r>
     </w:p>
     <w:p>
@@ -465,17 +460,17 @@
     </w:p>
     <w:p>
       <w:r>
-        <w:t xml:space="preserve">French — Good level. CV wording: Bon niveau.</w:t>
-      </w:r>
-    </w:p>
-    <w:p>
-      <w:r>
-        <w:t xml:space="preserve">English — Un peu Bien. Original CV wording. Reformulation of the stated level: basic / conversational English.</w:t>
-      </w:r>
-    </w:p>
-    <w:p>
-      <w:r>
-        <w:t xml:space="preserve">Swahili — Good level. CV wording: Bon niveau.</w:t>
+        <w:t xml:space="preserve">French — Good level</w:t>
+      </w:r>
+    </w:p>
+    <w:p>
+      <w:r>
+        <w:t xml:space="preserve">English — Un peu Bien</w:t>
+      </w:r>
+    </w:p>
+    <w:p>
+      <w:r>
+        <w:t xml:space="preserve">Swahili — Good level</w:t>
       </w:r>
     </w:p>
     <w:p>
@@ -504,24 +499,6 @@
     <w:p>
       <w:r>
         <w:t xml:space="preserve">• Information security</w:t>
-      </w:r>
-    </w:p>
-    <w:p>
-      <w:pPr>
-        <w:pStyle w:val="Heading2"/>
-      </w:pPr>
-      <w:r>
-        <w:t xml:space="preserve">Signature</w:t>
-      </w:r>
-    </w:p>
-    <w:p>
-      <w:r>
-        <w:t xml:space="preserve">Space reserved for a handwritten signature</w:t>
-      </w:r>
-    </w:p>
-    <w:p>
-      <w:r>
-        <w:t xml:space="preserve">Édouard Bengehya</w:t>
       </w:r>
     </w:p>
     <w:sectPr>

</xml_diff>